<commit_message>
Restore original terminal screenshots, use black instead of blue in report
Co-Authored-By: Claude Opus 5.5 <noreply@anthropic.com>
Claude-Session: https://claude.ai/code/session_01YZLFRrXsAP15ymx8FNcQBq
</commit_message>
<xml_diff>
--- a/docker-lab/Docker_Lab_Report.docx
+++ b/docker-lab/Docker_Lab_Report.docx
@@ -962,7 +962,7 @@
       <w:r>
         <w:drawing>
           <wp:inline distT="0" distB="0" distL="0" distR="0">
-            <wp:extent cx="5715000" cy="990600"/>
+            <wp:extent cx="5715000" cy="1095375"/>
             <wp:effectExtent t="0" r="0" b="0" l="0"/>
             <wp:docPr id="1" name="step01.png" descr="step01.png" title="step01.png"/>
             <wp:cNvGraphicFramePr>
@@ -987,7 +987,7 @@
                   <pic:spPr bwMode="auto">
                     <a:xfrm>
                       <a:off x="0" y="0"/>
-                      <a:ext cx="5715000" cy="990600"/>
+                      <a:ext cx="5715000" cy="1095375"/>
                     </a:xfrm>
                     <a:prstGeom prst="rect">
                       <a:avLst/>
@@ -1147,7 +1147,7 @@
       <w:r>
         <w:drawing>
           <wp:inline distT="0" distB="0" distL="0" distR="0">
-            <wp:extent cx="5715000" cy="3076575"/>
+            <wp:extent cx="5715000" cy="3419475"/>
             <wp:effectExtent t="0" r="0" b="0" l="0"/>
             <wp:docPr id="1" name="step02.png" descr="step02.png" title="step02.png"/>
             <wp:cNvGraphicFramePr>
@@ -1172,7 +1172,7 @@
                   <pic:spPr bwMode="auto">
                     <a:xfrm>
                       <a:off x="0" y="0"/>
-                      <a:ext cx="5715000" cy="3076575"/>
+                      <a:ext cx="5715000" cy="3419475"/>
                     </a:xfrm>
                     <a:prstGeom prst="rect">
                       <a:avLst/>
@@ -1434,7 +1434,7 @@
       <w:r>
         <w:drawing>
           <wp:inline distT="0" distB="0" distL="0" distR="0">
-            <wp:extent cx="5715000" cy="4124325"/>
+            <wp:extent cx="5715000" cy="4581525"/>
             <wp:effectExtent t="0" r="0" b="0" l="0"/>
             <wp:docPr id="1" name="step03.png" descr="step03.png" title="step03.png"/>
             <wp:cNvGraphicFramePr>
@@ -1459,7 +1459,7 @@
                   <pic:spPr bwMode="auto">
                     <a:xfrm>
                       <a:off x="0" y="0"/>
-                      <a:ext cx="5715000" cy="4124325"/>
+                      <a:ext cx="5715000" cy="4581525"/>
                     </a:xfrm>
                     <a:prstGeom prst="rect">
                       <a:avLst/>
@@ -1670,7 +1670,7 @@
       <w:r>
         <w:drawing>
           <wp:inline distT="0" distB="0" distL="0" distR="0">
-            <wp:extent cx="5715000" cy="1247775"/>
+            <wp:extent cx="5715000" cy="1381125"/>
             <wp:effectExtent t="0" r="0" b="0" l="0"/>
             <wp:docPr id="1" name="step04.png" descr="step04.png" title="step04.png"/>
             <wp:cNvGraphicFramePr>
@@ -1695,7 +1695,7 @@
                   <pic:spPr bwMode="auto">
                     <a:xfrm>
                       <a:off x="0" y="0"/>
-                      <a:ext cx="5715000" cy="1247775"/>
+                      <a:ext cx="5715000" cy="1381125"/>
                     </a:xfrm>
                     <a:prstGeom prst="rect">
                       <a:avLst/>
@@ -1957,7 +1957,7 @@
       <w:r>
         <w:drawing>
           <wp:inline distT="0" distB="0" distL="0" distR="0">
-            <wp:extent cx="5715000" cy="990600"/>
+            <wp:extent cx="5715000" cy="1190625"/>
             <wp:effectExtent t="0" r="0" b="0" l="0"/>
             <wp:docPr id="1" name="step05.png" descr="step05.png" title="step05.png"/>
             <wp:cNvGraphicFramePr>
@@ -1982,7 +1982,7 @@
                   <pic:spPr bwMode="auto">
                     <a:xfrm>
                       <a:off x="0" y="0"/>
-                      <a:ext cx="5715000" cy="990600"/>
+                      <a:ext cx="5715000" cy="1190625"/>
                     </a:xfrm>
                     <a:prstGeom prst="rect">
                       <a:avLst/>
@@ -2244,7 +2244,7 @@
       <w:r>
         <w:drawing>
           <wp:inline distT="0" distB="0" distL="0" distR="0">
-            <wp:extent cx="5715000" cy="1419225"/>
+            <wp:extent cx="5715000" cy="1581150"/>
             <wp:effectExtent t="0" r="0" b="0" l="0"/>
             <wp:docPr id="1" name="step06.png" descr="step06.png" title="step06.png"/>
             <wp:cNvGraphicFramePr>
@@ -2269,7 +2269,7 @@
                   <pic:spPr bwMode="auto">
                     <a:xfrm>
                       <a:off x="0" y="0"/>
-                      <a:ext cx="5715000" cy="1419225"/>
+                      <a:ext cx="5715000" cy="1581150"/>
                     </a:xfrm>
                     <a:prstGeom prst="rect">
                       <a:avLst/>
@@ -2633,7 +2633,7 @@
       <w:r>
         <w:drawing>
           <wp:inline distT="0" distB="0" distL="0" distR="0">
-            <wp:extent cx="5715000" cy="1419225"/>
+            <wp:extent cx="5715000" cy="1771650"/>
             <wp:effectExtent t="0" r="0" b="0" l="0"/>
             <wp:docPr id="1" name="step07.png" descr="step07.png" title="step07.png"/>
             <wp:cNvGraphicFramePr>
@@ -2658,7 +2658,7 @@
                   <pic:spPr bwMode="auto">
                     <a:xfrm>
                       <a:off x="0" y="0"/>
-                      <a:ext cx="5715000" cy="1419225"/>
+                      <a:ext cx="5715000" cy="1771650"/>
                     </a:xfrm>
                     <a:prstGeom prst="rect">
                       <a:avLst/>
@@ -2869,7 +2869,7 @@
       <w:r>
         <w:drawing>
           <wp:inline distT="0" distB="0" distL="0" distR="0">
-            <wp:extent cx="5715000" cy="2381250"/>
+            <wp:extent cx="5715000" cy="2647950"/>
             <wp:effectExtent t="0" r="0" b="0" l="0"/>
             <wp:docPr id="1" name="step08.png" descr="step08.png" title="step08.png"/>
             <wp:cNvGraphicFramePr>
@@ -2894,7 +2894,7 @@
                   <pic:spPr bwMode="auto">
                     <a:xfrm>
                       <a:off x="0" y="0"/>
-                      <a:ext cx="5715000" cy="2381250"/>
+                      <a:ext cx="5715000" cy="2647950"/>
                     </a:xfrm>
                     <a:prstGeom prst="rect">
                       <a:avLst/>
@@ -3156,7 +3156,7 @@
       <w:r>
         <w:drawing>
           <wp:inline distT="0" distB="0" distL="0" distR="0">
-            <wp:extent cx="5715000" cy="4305300"/>
+            <wp:extent cx="5715000" cy="4876800"/>
             <wp:effectExtent t="0" r="0" b="0" l="0"/>
             <wp:docPr id="1" name="step09.png" descr="step09.png" title="step09.png"/>
             <wp:cNvGraphicFramePr>
@@ -3181,7 +3181,7 @@
                   <pic:spPr bwMode="auto">
                     <a:xfrm>
                       <a:off x="0" y="0"/>
-                      <a:ext cx="5715000" cy="4305300"/>
+                      <a:ext cx="5715000" cy="4876800"/>
                     </a:xfrm>
                     <a:prstGeom prst="rect">
                       <a:avLst/>
@@ -3443,7 +3443,7 @@
       <w:r>
         <w:drawing>
           <wp:inline distT="0" distB="0" distL="0" distR="0">
-            <wp:extent cx="5715000" cy="1076325"/>
+            <wp:extent cx="5715000" cy="1381125"/>
             <wp:effectExtent t="0" r="0" b="0" l="0"/>
             <wp:docPr id="1" name="step10.png" descr="step10.png" title="step10.png"/>
             <wp:cNvGraphicFramePr>
@@ -3468,7 +3468,7 @@
                   <pic:spPr bwMode="auto">
                     <a:xfrm>
                       <a:off x="0" y="0"/>
-                      <a:ext cx="5715000" cy="1076325"/>
+                      <a:ext cx="5715000" cy="1381125"/>
                     </a:xfrm>
                     <a:prstGeom prst="rect">
                       <a:avLst/>
@@ -3889,7 +3889,7 @@
       <w:r>
         <w:drawing>
           <wp:inline distT="0" distB="0" distL="0" distR="0">
-            <wp:extent cx="5715000" cy="2124075"/>
+            <wp:extent cx="5715000" cy="2447925"/>
             <wp:effectExtent t="0" r="0" b="0" l="0"/>
             <wp:docPr id="1" name="step11.png" descr="step11.png" title="step11.png"/>
             <wp:cNvGraphicFramePr>
@@ -3914,7 +3914,7 @@
                   <pic:spPr bwMode="auto">
                     <a:xfrm>
                       <a:off x="0" y="0"/>
-                      <a:ext cx="5715000" cy="2124075"/>
+                      <a:ext cx="5715000" cy="2447925"/>
                     </a:xfrm>
                     <a:prstGeom prst="rect">
                       <a:avLst/>
@@ -4227,7 +4227,7 @@
       <w:r>
         <w:drawing>
           <wp:inline distT="0" distB="0" distL="0" distR="0">
-            <wp:extent cx="5715000" cy="990600"/>
+            <wp:extent cx="5715000" cy="1381125"/>
             <wp:effectExtent t="0" r="0" b="0" l="0"/>
             <wp:docPr id="1" name="step12.png" descr="step12.png" title="step12.png"/>
             <wp:cNvGraphicFramePr>
@@ -4252,7 +4252,7 @@
                   <pic:spPr bwMode="auto">
                     <a:xfrm>
                       <a:off x="0" y="0"/>
-                      <a:ext cx="5715000" cy="990600"/>
+                      <a:ext cx="5715000" cy="1381125"/>
                     </a:xfrm>
                     <a:prstGeom prst="rect">
                       <a:avLst/>
@@ -4565,7 +4565,7 @@
       <w:r>
         <w:drawing>
           <wp:inline distT="0" distB="0" distL="0" distR="0">
-            <wp:extent cx="5715000" cy="1419225"/>
+            <wp:extent cx="5715000" cy="1581150"/>
             <wp:effectExtent t="0" r="0" b="0" l="0"/>
             <wp:docPr id="1" name="step13.png" descr="step13.png" title="step13.png"/>
             <wp:cNvGraphicFramePr>
@@ -4590,7 +4590,7 @@
                   <pic:spPr bwMode="auto">
                     <a:xfrm>
                       <a:off x="0" y="0"/>
-                      <a:ext cx="5715000" cy="1419225"/>
+                      <a:ext cx="5715000" cy="1581150"/>
                     </a:xfrm>
                     <a:prstGeom prst="rect">
                       <a:avLst/>
@@ -4852,7 +4852,7 @@
       <w:r>
         <w:drawing>
           <wp:inline distT="0" distB="0" distL="0" distR="0">
-            <wp:extent cx="5715000" cy="990600"/>
+            <wp:extent cx="5715000" cy="1095375"/>
             <wp:effectExtent t="0" r="0" b="0" l="0"/>
             <wp:docPr id="1" name="step14.png" descr="step14.png" title="step14.png"/>
             <wp:cNvGraphicFramePr>
@@ -4877,7 +4877,7 @@
                   <pic:spPr bwMode="auto">
                     <a:xfrm>
                       <a:off x="0" y="0"/>
-                      <a:ext cx="5715000" cy="990600"/>
+                      <a:ext cx="5715000" cy="1095375"/>
                     </a:xfrm>
                     <a:prstGeom prst="rect">
                       <a:avLst/>
@@ -5190,7 +5190,7 @@
       <w:r>
         <w:drawing>
           <wp:inline distT="0" distB="0" distL="0" distR="0">
-            <wp:extent cx="5715000" cy="6219825"/>
+            <wp:extent cx="5715000" cy="7000875"/>
             <wp:effectExtent t="0" r="0" b="0" l="0"/>
             <wp:docPr id="1" name="step15.png" descr="step15.png" title="step15.png"/>
             <wp:cNvGraphicFramePr>
@@ -5215,7 +5215,7 @@
                   <pic:spPr bwMode="auto">
                     <a:xfrm>
                       <a:off x="0" y="0"/>
-                      <a:ext cx="5715000" cy="6219825"/>
+                      <a:ext cx="5715000" cy="7000875"/>
                     </a:xfrm>
                     <a:prstGeom prst="rect">
                       <a:avLst/>
@@ -5534,7 +5534,7 @@
       <w:r>
         <w:drawing>
           <wp:inline distT="0" distB="0" distL="0" distR="0">
-            <wp:extent cx="5715000" cy="1771650"/>
+            <wp:extent cx="5715000" cy="1962150"/>
             <wp:effectExtent t="0" r="0" b="0" l="0"/>
             <wp:docPr id="1" name="step16.png" descr="step16.png" title="step16.png"/>
             <wp:cNvGraphicFramePr>
@@ -5559,7 +5559,7 @@
                   <pic:spPr bwMode="auto">
                     <a:xfrm>
                       <a:off x="0" y="0"/>
-                      <a:ext cx="5715000" cy="1771650"/>
+                      <a:ext cx="5715000" cy="1962150"/>
                     </a:xfrm>
                     <a:prstGeom prst="rect">
                       <a:avLst/>
@@ -5923,7 +5923,7 @@
       <w:r>
         <w:drawing>
           <wp:inline distT="0" distB="0" distL="0" distR="0">
-            <wp:extent cx="5715000" cy="2381250"/>
+            <wp:extent cx="5715000" cy="2647950"/>
             <wp:effectExtent t="0" r="0" b="0" l="0"/>
             <wp:docPr id="1" name="step17.png" descr="step17.png" title="step17.png"/>
             <wp:cNvGraphicFramePr>
@@ -5948,7 +5948,7 @@
                   <pic:spPr bwMode="auto">
                     <a:xfrm>
                       <a:off x="0" y="0"/>
-                      <a:ext cx="5715000" cy="2381250"/>
+                      <a:ext cx="5715000" cy="2647950"/>
                     </a:xfrm>
                     <a:prstGeom prst="rect">
                       <a:avLst/>

</xml_diff>